<commit_message>
fix balashov address in docs
</commit_message>
<xml_diff>
--- a/server/docs/templates/ofertaFizBalashovIP.docx
+++ b/server/docs/templates/ofertaFizBalashovIP.docx
@@ -192,45 +192,7 @@
           <w:shd w:fill="auto" w:val="clear"/>
           <w:vertAlign w:val="baseline"/>
         </w:rPr>
-        <w:t xml:space="preserve">») между </w:t>
-      </w:r>
-      <w:r>
-        <w:rPr>
-          <w:rFonts w:eastAsia="Arial" w:cs="Arial" w:ascii="Arial" w:hAnsi="Arial"/>
-          <w:i w:val="false"/>
-          <w:caps w:val="false"/>
-          <w:smallCaps w:val="false"/>
-          <w:strike w:val="false"/>
-          <w:dstrike w:val="false"/>
-          <w:color w:val="000000"/>
-          <w:position w:val="0"/>
-          <w:sz w:val="22"/>
-          <w:sz w:val="22"/>
-          <w:szCs w:val="22"/>
-          <w:u w:val="none"/>
-          <w:shd w:fill="auto" w:val="clear"/>
-          <w:vertAlign w:val="baseline"/>
-        </w:rPr>
-        <w:t>и</w:t>
-      </w:r>
-      <w:r>
-        <w:rPr>
-          <w:rFonts w:eastAsia="Arial" w:cs="Arial" w:ascii="Arial" w:hAnsi="Arial"/>
-          <w:i w:val="false"/>
-          <w:caps w:val="false"/>
-          <w:smallCaps w:val="false"/>
-          <w:strike w:val="false"/>
-          <w:dstrike w:val="false"/>
-          <w:color w:val="000000"/>
-          <w:position w:val="0"/>
-          <w:sz w:val="22"/>
-          <w:sz w:val="22"/>
-          <w:szCs w:val="22"/>
-          <w:u w:val="none"/>
-          <w:shd w:fill="auto" w:val="clear"/>
-          <w:vertAlign w:val="baseline"/>
-        </w:rPr>
-        <w:t xml:space="preserve">сполнителем Платформы </w:t>
+        <w:t xml:space="preserve">») между исполнителем Платформы </w:t>
       </w:r>
       <w:r>
         <w:rPr>
@@ -4608,8 +4570,8 @@
         <w:tblLook w:val="0600"/>
       </w:tblPr>
       <w:tblGrid>
-        <w:gridCol w:w="2548"/>
-        <w:gridCol w:w="6807"/>
+        <w:gridCol w:w="2547"/>
+        <w:gridCol w:w="6808"/>
       </w:tblGrid>
       <w:tr>
         <w:trPr>
@@ -4617,7 +4579,7 @@
         </w:trPr>
         <w:tc>
           <w:tcPr>
-            <w:tcW w:w="2548" w:type="dxa"/>
+            <w:tcW w:w="2547" w:type="dxa"/>
             <w:tcBorders>
               <w:top w:val="single" w:sz="8" w:space="0" w:color="000000"/>
               <w:left w:val="single" w:sz="8" w:space="0" w:color="000000"/>
@@ -4654,7 +4616,7 @@
         </w:tc>
         <w:tc>
           <w:tcPr>
-            <w:tcW w:w="6807" w:type="dxa"/>
+            <w:tcW w:w="6808" w:type="dxa"/>
             <w:tcBorders>
               <w:top w:val="single" w:sz="8" w:space="0" w:color="000000"/>
               <w:left w:val="single" w:sz="8" w:space="0" w:color="000000"/>
@@ -4693,7 +4655,7 @@
         </w:trPr>
         <w:tc>
           <w:tcPr>
-            <w:tcW w:w="2548" w:type="dxa"/>
+            <w:tcW w:w="2547" w:type="dxa"/>
             <w:tcBorders>
               <w:top w:val="single" w:sz="8" w:space="0" w:color="000000"/>
               <w:left w:val="single" w:sz="8" w:space="0" w:color="000000"/>
@@ -4731,7 +4693,7 @@
         </w:tc>
         <w:tc>
           <w:tcPr>
-            <w:tcW w:w="6807" w:type="dxa"/>
+            <w:tcW w:w="6808" w:type="dxa"/>
             <w:tcBorders>
               <w:top w:val="single" w:sz="8" w:space="0" w:color="000000"/>
               <w:left w:val="single" w:sz="8" w:space="0" w:color="000000"/>
@@ -4770,7 +4732,7 @@
         </w:trPr>
         <w:tc>
           <w:tcPr>
-            <w:tcW w:w="2548" w:type="dxa"/>
+            <w:tcW w:w="2547" w:type="dxa"/>
             <w:tcBorders>
               <w:top w:val="single" w:sz="8" w:space="0" w:color="000000"/>
               <w:left w:val="single" w:sz="8" w:space="0" w:color="000000"/>
@@ -4808,7 +4770,7 @@
         </w:tc>
         <w:tc>
           <w:tcPr>
-            <w:tcW w:w="6807" w:type="dxa"/>
+            <w:tcW w:w="6808" w:type="dxa"/>
             <w:tcBorders>
               <w:top w:val="single" w:sz="8" w:space="0" w:color="000000"/>
               <w:left w:val="single" w:sz="8" w:space="0" w:color="000000"/>
@@ -4847,7 +4809,7 @@
         </w:trPr>
         <w:tc>
           <w:tcPr>
-            <w:tcW w:w="2548" w:type="dxa"/>
+            <w:tcW w:w="2547" w:type="dxa"/>
             <w:tcBorders>
               <w:top w:val="single" w:sz="8" w:space="0" w:color="000000"/>
               <w:left w:val="single" w:sz="8" w:space="0" w:color="000000"/>
@@ -4884,7 +4846,7 @@
         </w:tc>
         <w:tc>
           <w:tcPr>
-            <w:tcW w:w="6807" w:type="dxa"/>
+            <w:tcW w:w="6808" w:type="dxa"/>
             <w:tcBorders>
               <w:top w:val="single" w:sz="8" w:space="0" w:color="000000"/>
               <w:left w:val="single" w:sz="8" w:space="0" w:color="000000"/>
@@ -4911,7 +4873,25 @@
                 <w:szCs w:val="20"/>
                 <w:highlight w:val="white"/>
               </w:rPr>
-              <w:t>412031, Россия, Сартовская обл., г. Ртищево, ул. Пролетарская, д. 2, кв. 87</w:t>
+              <w:t>412031, Россия, Сар</w:t>
+            </w:r>
+            <w:r>
+              <w:rPr>
+                <w:rFonts w:eastAsia="Arial" w:cs="Arial" w:ascii="Arial" w:hAnsi="Arial"/>
+                <w:sz w:val="20"/>
+                <w:szCs w:val="20"/>
+                <w:highlight w:val="white"/>
+              </w:rPr>
+              <w:t>а</w:t>
+            </w:r>
+            <w:r>
+              <w:rPr>
+                <w:rFonts w:eastAsia="Arial" w:cs="Arial" w:ascii="Arial" w:hAnsi="Arial"/>
+                <w:sz w:val="20"/>
+                <w:szCs w:val="20"/>
+                <w:highlight w:val="white"/>
+              </w:rPr>
+              <w:t>товская обл., г. Ртищево, ул. Пролетарская, д. 2, кв. 87</w:t>
             </w:r>
           </w:p>
         </w:tc>
@@ -4922,7 +4902,7 @@
         </w:trPr>
         <w:tc>
           <w:tcPr>
-            <w:tcW w:w="2548" w:type="dxa"/>
+            <w:tcW w:w="2547" w:type="dxa"/>
             <w:tcBorders>
               <w:top w:val="single" w:sz="8" w:space="0" w:color="000000"/>
               <w:left w:val="single" w:sz="8" w:space="0" w:color="000000"/>
@@ -4959,7 +4939,7 @@
         </w:tc>
         <w:tc>
           <w:tcPr>
-            <w:tcW w:w="6807" w:type="dxa"/>
+            <w:tcW w:w="6808" w:type="dxa"/>
             <w:tcBorders>
               <w:top w:val="single" w:sz="8" w:space="0" w:color="000000"/>
               <w:left w:val="single" w:sz="8" w:space="0" w:color="000000"/>
@@ -4997,7 +4977,7 @@
         </w:trPr>
         <w:tc>
           <w:tcPr>
-            <w:tcW w:w="2548" w:type="dxa"/>
+            <w:tcW w:w="2547" w:type="dxa"/>
             <w:tcBorders>
               <w:top w:val="single" w:sz="8" w:space="0" w:color="000000"/>
               <w:left w:val="single" w:sz="8" w:space="0" w:color="000000"/>
@@ -5034,7 +5014,7 @@
         </w:tc>
         <w:tc>
           <w:tcPr>
-            <w:tcW w:w="6807" w:type="dxa"/>
+            <w:tcW w:w="6808" w:type="dxa"/>
             <w:tcBorders>
               <w:top w:val="single" w:sz="8" w:space="0" w:color="000000"/>
               <w:left w:val="single" w:sz="8" w:space="0" w:color="000000"/>
@@ -5072,7 +5052,7 @@
         </w:trPr>
         <w:tc>
           <w:tcPr>
-            <w:tcW w:w="2548" w:type="dxa"/>
+            <w:tcW w:w="2547" w:type="dxa"/>
             <w:tcBorders>
               <w:top w:val="single" w:sz="8" w:space="0" w:color="000000"/>
               <w:left w:val="single" w:sz="8" w:space="0" w:color="000000"/>
@@ -5109,7 +5089,7 @@
         </w:tc>
         <w:tc>
           <w:tcPr>
-            <w:tcW w:w="6807" w:type="dxa"/>
+            <w:tcW w:w="6808" w:type="dxa"/>
             <w:tcBorders>
               <w:top w:val="single" w:sz="8" w:space="0" w:color="000000"/>
               <w:left w:val="single" w:sz="8" w:space="0" w:color="000000"/>
@@ -5147,7 +5127,7 @@
         </w:trPr>
         <w:tc>
           <w:tcPr>
-            <w:tcW w:w="2548" w:type="dxa"/>
+            <w:tcW w:w="2547" w:type="dxa"/>
             <w:tcBorders>
               <w:top w:val="single" w:sz="8" w:space="0" w:color="000000"/>
               <w:left w:val="single" w:sz="8" w:space="0" w:color="000000"/>
@@ -5184,7 +5164,7 @@
         </w:tc>
         <w:tc>
           <w:tcPr>
-            <w:tcW w:w="6807" w:type="dxa"/>
+            <w:tcW w:w="6808" w:type="dxa"/>
             <w:tcBorders>
               <w:top w:val="single" w:sz="8" w:space="0" w:color="000000"/>
               <w:left w:val="single" w:sz="8" w:space="0" w:color="000000"/>
@@ -5222,7 +5202,7 @@
         </w:trPr>
         <w:tc>
           <w:tcPr>
-            <w:tcW w:w="2548" w:type="dxa"/>
+            <w:tcW w:w="2547" w:type="dxa"/>
             <w:tcBorders>
               <w:top w:val="single" w:sz="8" w:space="0" w:color="000000"/>
               <w:left w:val="single" w:sz="8" w:space="0" w:color="000000"/>
@@ -5260,7 +5240,7 @@
         </w:tc>
         <w:tc>
           <w:tcPr>
-            <w:tcW w:w="6807" w:type="dxa"/>
+            <w:tcW w:w="6808" w:type="dxa"/>
             <w:tcBorders>
               <w:top w:val="single" w:sz="8" w:space="0" w:color="000000"/>
               <w:left w:val="single" w:sz="8" w:space="0" w:color="000000"/>
@@ -6380,6 +6360,28 @@
       <w:u w:val="single"/>
     </w:rPr>
   </w:style>
+  <w:style w:type="character" w:styleId="ListLabel7">
+    <w:name w:val="ListLabel 7"/>
+    <w:qFormat/>
+    <w:rPr>
+      <w:rFonts w:ascii="Arial" w:hAnsi="Arial" w:eastAsia="Arial" w:cs="Arial"/>
+      <w:color w:val="0000FF"/>
+      <w:sz w:val="22"/>
+      <w:szCs w:val="22"/>
+      <w:u w:val="single"/>
+    </w:rPr>
+  </w:style>
+  <w:style w:type="character" w:styleId="ListLabel8">
+    <w:name w:val="ListLabel 8"/>
+    <w:qFormat/>
+    <w:rPr>
+      <w:rFonts w:ascii="Arial" w:hAnsi="Arial" w:eastAsia="Arial" w:cs="Arial"/>
+      <w:color w:val="1155CC"/>
+      <w:sz w:val="20"/>
+      <w:szCs w:val="20"/>
+      <w:u w:val="single"/>
+    </w:rPr>
+  </w:style>
   <w:style w:type="paragraph" w:styleId="Heading">
     <w:name w:val="Heading"/>
     <w:basedOn w:val="Normal"/>

</xml_diff>